<commit_message>
Add ORCID identifiers for author and advisors
- Randerson Oliveira Melville Rebouças: 0009-0005-3056-5074
- Marcelo Magalhães Foohs (advisor):     0000-0002-4735-0732
- Rosa Maria Vicari (co-advisor):        0000-0002-6909-6405

Updated: CITATION.cff, paper (md/pdf/docx), README.md, README.pt-br.md,
report/index.html. ORCID is the international persistent identifier
required by major venues (BEA, AIED, EMNLP, RBIE).

Co-Authored-By: Claude Opus 4.7 (1M context) <noreply@anthropic.com>
</commit_message>
<xml_diff>
--- a/paper/artigo_benchmark_slm.docx
+++ b/paper/artigo_benchmark_slm.docx
@@ -55,6 +55,27 @@
           <w:spacing w:val="0"/>
           <w:color w:val="1A1A1A"/>
         </w:rPr>
+        <w:t xml:space="preserve"> </w:t>
+      </w:r>
+      <w:r>
+        <w:rPr>
+          <w:rFonts w:ascii="Helvetica" w:hAnsi="Helvetica" w:cs="Helvetica"/>
+          <w:sz w:val="29"/>
+          <w:sz-cs w:val="29"/>
+          <w:u w:val="single"/>
+          <w:spacing w:val="0"/>
+          <w:color w:val="092F9D"/>
+        </w:rPr>
+        <w:t xml:space="preserve">ORCID: 0009-0005-3056-5074</w:t>
+      </w:r>
+      <w:r>
+        <w:rPr>
+          <w:rFonts w:ascii="Helvetica" w:hAnsi="Helvetica" w:cs="Helvetica"/>
+          <w:sz w:val="29"/>
+          <w:sz-cs w:val="29"/>
+          <w:spacing w:val="0"/>
+          <w:color w:val="1A1A1A"/>
+        </w:rPr>
         <w:t xml:space="preserve"/>
       </w:r>
     </w:p>
@@ -107,7 +128,49 @@
           <w:spacing w:val="0"/>
           <w:color w:val="1A1A1A"/>
         </w:rPr>
-        <w:t xml:space="preserve">Advisor: Prof. Dr. Marcelo Magalhães Foohs (PPGIE/UFRGS) Co-advisor: Profa. Dra. Rosa Maria Vicari (PPGIE/UFRGS)</w:t>
+        <w:t xml:space="preserve">Advisor: Prof. Dr. Marcelo Magalhães Foohs (PPGIE/UFRGS) </w:t>
+      </w:r>
+      <w:r>
+        <w:rPr>
+          <w:rFonts w:ascii="Helvetica" w:hAnsi="Helvetica" w:cs="Helvetica"/>
+          <w:sz w:val="29"/>
+          <w:sz-cs w:val="29"/>
+          <w:u w:val="single"/>
+          <w:spacing w:val="0"/>
+          <w:color w:val="092F9D"/>
+        </w:rPr>
+        <w:t xml:space="preserve">ORCID: 0000-0002-4735-0732</w:t>
+      </w:r>
+      <w:r>
+        <w:rPr>
+          <w:rFonts w:ascii="Helvetica" w:hAnsi="Helvetica" w:cs="Helvetica"/>
+          <w:sz w:val="29"/>
+          <w:sz-cs w:val="29"/>
+          <w:spacing w:val="0"/>
+          <w:color w:val="1A1A1A"/>
+        </w:rPr>
+        <w:t xml:space="preserve"> Co-advisor: Profa. Dra. Rosa Maria Vicari (PPGIE/UFRGS) </w:t>
+      </w:r>
+      <w:r>
+        <w:rPr>
+          <w:rFonts w:ascii="Helvetica" w:hAnsi="Helvetica" w:cs="Helvetica"/>
+          <w:sz w:val="29"/>
+          <w:sz-cs w:val="29"/>
+          <w:u w:val="single"/>
+          <w:spacing w:val="0"/>
+          <w:color w:val="092F9D"/>
+        </w:rPr>
+        <w:t xml:space="preserve">ORCID: 0000-0002-6909-6405</w:t>
+      </w:r>
+      <w:r>
+        <w:rPr>
+          <w:rFonts w:ascii="Helvetica" w:hAnsi="Helvetica" w:cs="Helvetica"/>
+          <w:sz w:val="29"/>
+          <w:sz-cs w:val="29"/>
+          <w:spacing w:val="0"/>
+          <w:color w:val="1A1A1A"/>
+        </w:rPr>
+        <w:t xml:space="preserve"/>
       </w:r>
     </w:p>
     <w:p>

</xml_diff>

<commit_message>
Fix PDF parser: backticks now shielded from asterisk-rules
The previous APA-style notation with `***` / `**` / `*` inside backticks
caused reportlab to fail parsing nested tags (saw </font> instead of </b>).

Fix: in paper/md_to_pdf.py, process backtick blocks first via placeholder
stash, then process asterisk-based markup on shielded text, then restore.
PDF now renders the full §3.5 inferential framework section correctly.

Co-Authored-By: Claude Opus 4.7 (1M context) <noreply@anthropic.com>
</commit_message>
<xml_diff>
--- a/paper/artigo_benchmark_slm.docx
+++ b/paper/artigo_benchmark_slm.docx
@@ -3347,72 +3347,39 @@
           <w:spacing w:val="0"/>
           <w:color w:val="1A1A1A"/>
         </w:rPr>
-        <w:t xml:space="preserve"> &lt; 0.001 \</w:t>
-      </w:r>
-      <w:r>
-        <w:rPr>
-          <w:rFonts w:ascii="Helvetica" w:hAnsi="Helvetica" w:cs="Helvetica"/>
-          <w:sz w:val="29"/>
-          <w:sz-cs w:val="29"/>
-          <w:b/>
-          <w:i/>
-          <w:spacing w:val="0"/>
-          <w:color w:val="1A1A1A"/>
-        </w:rPr>
-        <w:t xml:space="preserve">, </w:t>
-      </w:r>
-      <w:r>
-        <w:rPr>
-          <w:rFonts w:ascii="Helvetica" w:hAnsi="Helvetica" w:cs="Helvetica"/>
-          <w:sz w:val="29"/>
-          <w:sz-cs w:val="29"/>
-          <w:b/>
-          <w:spacing w:val="0"/>
-          <w:color w:val="1A1A1A"/>
-        </w:rPr>
-        <w:t xml:space="preserve">p* &lt; 0.01 \</w:t>
-      </w:r>
-      <w:r>
-        <w:rPr>
-          <w:rFonts w:ascii="Helvetica" w:hAnsi="Helvetica" w:cs="Helvetica"/>
-          <w:sz w:val="29"/>
-          <w:sz-cs w:val="29"/>
-          <w:spacing w:val="0"/>
-          <w:color w:val="1A1A1A"/>
-        </w:rPr>
-        <w:t xml:space="preserve">, </w:t>
-      </w:r>
-      <w:r>
-        <w:rPr>
-          <w:rFonts w:ascii="Helvetica" w:hAnsi="Helvetica" w:cs="Helvetica"/>
-          <w:sz w:val="29"/>
-          <w:sz-cs w:val="29"/>
-          <w:i/>
-          <w:spacing w:val="0"/>
-          <w:color w:val="1A1A1A"/>
-        </w:rPr>
-        <w:t xml:space="preserve">p</w:t>
-      </w:r>
-      <w:r>
-        <w:rPr>
-          <w:rFonts w:ascii="Helvetica" w:hAnsi="Helvetica" w:cs="Helvetica"/>
-          <w:sz w:val="29"/>
-          <w:sz-cs w:val="29"/>
-          <w:spacing w:val="0"/>
-          <w:color w:val="1A1A1A"/>
-        </w:rPr>
-        <w:t xml:space="preserve"> &lt; 0.05 \</w:t>
-      </w:r>
-      <w:r>
-        <w:rPr>
-          <w:rFonts w:ascii="Helvetica" w:hAnsi="Helvetica" w:cs="Helvetica"/>
-          <w:sz w:val="29"/>
-          <w:sz-cs w:val="29"/>
-          <w:i/>
-          <w:spacing w:val="0"/>
-          <w:color w:val="1A1A1A"/>
-        </w:rPr>
-        <w:t xml:space="preserve">, </w:t>
+        <w:t xml:space="preserve"> &lt; 0.001 `</w:t>
+      </w:r>
+      <w:r>
+        <w:rPr>
+          <w:rFonts w:ascii="Courier New" w:hAnsi="Courier New" w:cs="Courier New"/>
+          <w:sz w:val="25"/>
+          <w:sz-cs w:val="25"/>
+          <w:b/>
+          <w:spacing w:val="0"/>
+          <w:color w:val="1A1A1A"/>
+        </w:rPr>
+        <w:t xml:space="preserve">*, *p* &lt; 0.01 \</w:t>
+      </w:r>
+      <w:r>
+        <w:rPr>
+          <w:rFonts w:ascii="Courier New" w:hAnsi="Courier New" w:cs="Courier New"/>
+          <w:sz w:val="25"/>
+          <w:sz-cs w:val="25"/>
+          <w:spacing w:val="0"/>
+          <w:color w:val="1A1A1A"/>
+        </w:rPr>
+        <w:t xml:space="preserve">, *p* &lt; 0.05 \</w:t>
+      </w:r>
+      <w:r>
+        <w:rPr>
+          <w:rFonts w:ascii="Helvetica" w:hAnsi="Helvetica" w:cs="Helvetica"/>
+          <w:sz w:val="29"/>
+          <w:sz-cs w:val="29"/>
+          <w:i/>
+          <w:spacing w:val="0"/>
+          <w:color w:val="1A1A1A"/>
+        </w:rPr>
+        <w:t xml:space="preserve">`, </w:t>
       </w:r>
       <w:r>
         <w:rPr>
@@ -7435,17 +7402,17 @@
           <w:spacing w:val="0"/>
           <w:color w:val="1A1A1A"/>
         </w:rPr>
-        <w:t xml:space="preserve"> &lt; 0.001 \</w:t>
-      </w:r>
-      <w:r>
-        <w:rPr>
-          <w:rFonts w:ascii="Helvetica" w:hAnsi="Helvetica" w:cs="Helvetica"/>
-          <w:sz w:val="26"/>
-          <w:sz-cs w:val="26"/>
-          <w:spacing w:val="0"/>
-          <w:color w:val="1A1A1A"/>
-        </w:rPr>
-        <w:t xml:space="preserve">*</w:t>
+        <w:t xml:space="preserve"> &lt; 0.001 `</w:t>
+      </w:r>
+      <w:r>
+        <w:rPr>
+          <w:rFonts w:ascii="Helvetica" w:hAnsi="Helvetica" w:cs="Helvetica"/>
+          <w:sz w:val="26"/>
+          <w:sz-cs w:val="26"/>
+          <w:spacing w:val="0"/>
+          <w:color w:val="1A1A1A"/>
+        </w:rPr>
+        <w:t xml:space="preserve">`*</w:t>
       </w:r>
     </w:p>
     <w:p>
@@ -7556,17 +7523,17 @@
           <w:spacing w:val="0"/>
           <w:color w:val="1A1A1A"/>
         </w:rPr>
-        <w:t xml:space="preserve"> &lt; 0.001 \</w:t>
-      </w:r>
-      <w:r>
-        <w:rPr>
-          <w:rFonts w:ascii="Helvetica" w:hAnsi="Helvetica" w:cs="Helvetica"/>
-          <w:sz w:val="26"/>
-          <w:sz-cs w:val="26"/>
-          <w:spacing w:val="0"/>
-          <w:color w:val="1A1A1A"/>
-        </w:rPr>
-        <w:t xml:space="preserve">*</w:t>
+        <w:t xml:space="preserve"> &lt; 0.001 `</w:t>
+      </w:r>
+      <w:r>
+        <w:rPr>
+          <w:rFonts w:ascii="Helvetica" w:hAnsi="Helvetica" w:cs="Helvetica"/>
+          <w:sz w:val="26"/>
+          <w:sz-cs w:val="26"/>
+          <w:spacing w:val="0"/>
+          <w:color w:val="1A1A1A"/>
+        </w:rPr>
+        <w:t xml:space="preserve">`*</w:t>
       </w:r>
     </w:p>
     <w:p>
@@ -7677,17 +7644,17 @@
           <w:spacing w:val="0"/>
           <w:color w:val="1A1A1A"/>
         </w:rPr>
-        <w:t xml:space="preserve"> &lt; 0.001 \</w:t>
-      </w:r>
-      <w:r>
-        <w:rPr>
-          <w:rFonts w:ascii="Helvetica" w:hAnsi="Helvetica" w:cs="Helvetica"/>
-          <w:sz w:val="26"/>
-          <w:sz-cs w:val="26"/>
-          <w:spacing w:val="0"/>
-          <w:color w:val="1A1A1A"/>
-        </w:rPr>
-        <w:t xml:space="preserve">*</w:t>
+        <w:t xml:space="preserve"> &lt; 0.001 `</w:t>
+      </w:r>
+      <w:r>
+        <w:rPr>
+          <w:rFonts w:ascii="Helvetica" w:hAnsi="Helvetica" w:cs="Helvetica"/>
+          <w:sz w:val="26"/>
+          <w:sz-cs w:val="26"/>
+          <w:spacing w:val="0"/>
+          <w:color w:val="1A1A1A"/>
+        </w:rPr>
+        <w:t xml:space="preserve">`*</w:t>
       </w:r>
     </w:p>
     <w:p>
@@ -7704,13 +7671,13 @@
           <w:spacing w:val="0"/>
           <w:color w:val="1A1A1A"/>
         </w:rPr>
-        <w:t xml:space="preserve">Note. k = conformant responses; n = 39 calls per model. \</w:t>
-      </w:r>
-      <w:r>
-        <w:rPr>
-          <w:rFonts w:ascii="Helvetica" w:hAnsi="Helvetica" w:cs="Helvetica"/>
-          <w:sz w:val="29"/>
-          <w:sz-cs w:val="29"/>
+        <w:t xml:space="preserve">Note. k = conformant responses; n = 39 calls per model. `</w:t>
+      </w:r>
+      <w:r>
+        <w:rPr>
+          <w:rFonts w:ascii="Courier New" w:hAnsi="Courier New" w:cs="Courier New"/>
+          <w:sz w:val="25"/>
+          <w:sz-cs w:val="25"/>
           <w:spacing w:val="0"/>
           <w:color w:val="1A1A1A"/>
         </w:rPr>
@@ -7718,9 +7685,9 @@
       </w:r>
       <w:r>
         <w:rPr>
-          <w:rFonts w:ascii="Helvetica" w:hAnsi="Helvetica" w:cs="Helvetica"/>
-          <w:sz w:val="29"/>
-          <w:sz-cs w:val="29"/>
+          <w:rFonts w:ascii="Courier New" w:hAnsi="Courier New" w:cs="Courier New"/>
+          <w:sz w:val="25"/>
+          <w:sz-cs w:val="25"/>
           <w:i/>
           <w:spacing w:val="0"/>
           <w:color w:val="1A1A1A"/>
@@ -7735,7 +7702,7 @@
           <w:spacing w:val="0"/>
           <w:color w:val="1A1A1A"/>
         </w:rPr>
-        <w:t xml:space="preserve"> p &lt; 0.001, two-sided Fisher exact, α = 0.05. When a cell of the contingency table is zero, the odds ratio is not finitely estimable; the reported p-value derives from the exact hypergeometric distribution with continuity correction. Wilson 95 % CIs computed without normal approximation.*</w:t>
+        <w:t xml:space="preserve">` p &lt; 0.001, two-sided Fisher exact, α = 0.05. When a cell of the contingency table is zero, the odds ratio is not finitely estimable; the reported p-value derives from the exact hypergeometric distribution with continuity correction. Wilson 95 % CIs computed without normal approximation.*</w:t>
       </w:r>
     </w:p>
     <w:p>
@@ -8047,13 +8014,13 @@
           <w:spacing w:val="0"/>
           <w:color w:val="1A1A1A"/>
         </w:rPr>
-        <w:t xml:space="preserve"> &lt; 0.001 \</w:t>
-      </w:r>
-      <w:r>
-        <w:rPr>
-          <w:rFonts w:ascii="Helvetica" w:hAnsi="Helvetica" w:cs="Helvetica"/>
-          <w:sz w:val="29"/>
-          <w:sz-cs w:val="29"/>
+        <w:t xml:space="preserve"> &lt; 0.001 `</w:t>
+      </w:r>
+      <w:r>
+        <w:rPr>
+          <w:rFonts w:ascii="Courier New" w:hAnsi="Courier New" w:cs="Courier New"/>
+          <w:sz w:val="25"/>
+          <w:sz-cs w:val="25"/>
           <w:i/>
           <w:spacing w:val="0"/>
           <w:color w:val="1A1A1A"/>
@@ -8062,9 +8029,9 @@
       </w:r>
       <w:r>
         <w:rPr>
-          <w:rFonts w:ascii="Helvetica" w:hAnsi="Helvetica" w:cs="Helvetica"/>
-          <w:sz w:val="29"/>
-          <w:sz-cs w:val="29"/>
+          <w:rFonts w:ascii="Courier New" w:hAnsi="Courier New" w:cs="Courier New"/>
+          <w:sz w:val="25"/>
+          <w:sz-cs w:val="25"/>
           <w:spacing w:val="0"/>
           <w:color w:val="1A1A1A"/>
         </w:rPr>
@@ -8079,7 +8046,7 @@
           <w:spacing w:val="0"/>
           <w:color w:val="1A1A1A"/>
         </w:rPr>
-        <w:t xml:space="preserve"> for both variants (1B and 3B), while the matched-scale Qwen 2.5 family is statistically indistinguishable from the reference (</w:t>
+        <w:t xml:space="preserve">` for both variants (1B and 3B), while the matched-scale Qwen 2.5 family is statistically indistinguishable from the reference (</w:t>
       </w:r>
       <w:r>
         <w:rPr>
@@ -8733,13 +8700,13 @@
           <w:spacing w:val="0"/>
           <w:color w:val="1A1A1A"/>
         </w:rPr>
-        <w:t xml:space="preserve"> &lt; 0.001 \</w:t>
-      </w:r>
-      <w:r>
-        <w:rPr>
-          <w:rFonts w:ascii="Helvetica" w:hAnsi="Helvetica" w:cs="Helvetica"/>
-          <w:sz w:val="29"/>
-          <w:sz-cs w:val="29"/>
+        <w:t xml:space="preserve"> &lt; 0.001 `</w:t>
+      </w:r>
+      <w:r>
+        <w:rPr>
+          <w:rFonts w:ascii="Courier New" w:hAnsi="Courier New" w:cs="Courier New"/>
+          <w:sz w:val="25"/>
+          <w:sz-cs w:val="25"/>
           <w:i/>
           <w:spacing w:val="0"/>
           <w:color w:val="1A1A1A"/>
@@ -8748,13 +8715,23 @@
       </w:r>
       <w:r>
         <w:rPr>
-          <w:rFonts w:ascii="Helvetica" w:hAnsi="Helvetica" w:cs="Helvetica"/>
-          <w:sz w:val="29"/>
-          <w:sz-cs w:val="29"/>
-          <w:spacing w:val="0"/>
-          <w:color w:val="1A1A1A"/>
-        </w:rPr>
-        <w:t xml:space="preserve">\*, of the same magnitude as the Llama 3.2 family contrasts, justifying its analytical bracketing in the same regime of zero-shot non-adherence.</w:t>
+          <w:rFonts w:ascii="Courier New" w:hAnsi="Courier New" w:cs="Courier New"/>
+          <w:sz w:val="25"/>
+          <w:sz-cs w:val="25"/>
+          <w:spacing w:val="0"/>
+          <w:color w:val="1A1A1A"/>
+        </w:rPr>
+        <w:t xml:space="preserve">\</w:t>
+      </w:r>
+      <w:r>
+        <w:rPr>
+          <w:rFonts w:ascii="Helvetica" w:hAnsi="Helvetica" w:cs="Helvetica"/>
+          <w:sz w:val="29"/>
+          <w:sz-cs w:val="29"/>
+          <w:spacing w:val="0"/>
+          <w:color w:val="1A1A1A"/>
+        </w:rPr>
+        <w:t xml:space="preserve">*`, of the same magnitude as the Llama 3.2 family contrasts, justifying its analytical bracketing in the same regime of zero-shot non-adherence.</w:t>
       </w:r>
     </w:p>
     <w:p>
@@ -9499,17 +9476,17 @@
           <w:spacing w:val="0"/>
           <w:color w:val="1A1A1A"/>
         </w:rPr>
-        <w:t xml:space="preserve"> &lt; 0.001 \</w:t>
-      </w:r>
-      <w:r>
-        <w:rPr>
-          <w:rFonts w:ascii="Helvetica" w:hAnsi="Helvetica" w:cs="Helvetica"/>
-          <w:sz w:val="26"/>
-          <w:sz-cs w:val="26"/>
-          <w:spacing w:val="0"/>
-          <w:color w:val="1A1A1A"/>
-        </w:rPr>
-        <w:t xml:space="preserve">*</w:t>
+        <w:t xml:space="preserve"> &lt; 0.001 `</w:t>
+      </w:r>
+      <w:r>
+        <w:rPr>
+          <w:rFonts w:ascii="Helvetica" w:hAnsi="Helvetica" w:cs="Helvetica"/>
+          <w:sz w:val="26"/>
+          <w:sz-cs w:val="26"/>
+          <w:spacing w:val="0"/>
+          <w:color w:val="1A1A1A"/>
+        </w:rPr>
+        <w:t xml:space="preserve">`*</w:t>
       </w:r>
     </w:p>
     <w:p>
@@ -9649,17 +9626,17 @@
           <w:spacing w:val="0"/>
           <w:color w:val="1A1A1A"/>
         </w:rPr>
-        <w:t xml:space="preserve"> &lt; 0.001 \</w:t>
-      </w:r>
-      <w:r>
-        <w:rPr>
-          <w:rFonts w:ascii="Helvetica" w:hAnsi="Helvetica" w:cs="Helvetica"/>
-          <w:sz w:val="26"/>
-          <w:sz-cs w:val="26"/>
-          <w:spacing w:val="0"/>
-          <w:color w:val="1A1A1A"/>
-        </w:rPr>
-        <w:t xml:space="preserve">*</w:t>
+        <w:t xml:space="preserve"> &lt; 0.001 `</w:t>
+      </w:r>
+      <w:r>
+        <w:rPr>
+          <w:rFonts w:ascii="Helvetica" w:hAnsi="Helvetica" w:cs="Helvetica"/>
+          <w:sz w:val="26"/>
+          <w:sz-cs w:val="26"/>
+          <w:spacing w:val="0"/>
+          <w:color w:val="1A1A1A"/>
+        </w:rPr>
+        <w:t xml:space="preserve">`*</w:t>
       </w:r>
     </w:p>
     <w:p>
@@ -9760,13 +9737,13 @@
           <w:spacing w:val="0"/>
           <w:color w:val="1A1A1A"/>
         </w:rPr>
-        <w:t xml:space="preserve">Note. ¹ The single non-conformance of the 1B in E2 derives from HTTP timeout, not from a structural violation of the response actually returned. ² Idem for 3 of 12 of the 1B in E2b — timeouts associated with the context-budget increase introduced by the demonstrative pair of one-shot, with no implication on the typological conformance of the completed calls. \</w:t>
-      </w:r>
-      <w:r>
-        <w:rPr>
-          <w:rFonts w:ascii="Helvetica" w:hAnsi="Helvetica" w:cs="Helvetica"/>
-          <w:sz w:val="29"/>
-          <w:sz-cs w:val="29"/>
+        <w:t xml:space="preserve">Note. ¹ The single non-conformance of the 1B in E2 derives from HTTP timeout, not from a structural violation of the response actually returned. ² Idem for 3 of 12 of the 1B in E2b — timeouts associated with the context-budget increase introduced by the demonstrative pair of one-shot, with no implication on the typological conformance of the completed calls. `</w:t>
+      </w:r>
+      <w:r>
+        <w:rPr>
+          <w:rFonts w:ascii="Courier New" w:hAnsi="Courier New" w:cs="Courier New"/>
+          <w:sz w:val="25"/>
+          <w:sz-cs w:val="25"/>
           <w:spacing w:val="0"/>
           <w:color w:val="1A1A1A"/>
         </w:rPr>
@@ -9774,9 +9751,9 @@
       </w:r>
       <w:r>
         <w:rPr>
-          <w:rFonts w:ascii="Helvetica" w:hAnsi="Helvetica" w:cs="Helvetica"/>
-          <w:sz w:val="29"/>
-          <w:sz-cs w:val="29"/>
+          <w:rFonts w:ascii="Courier New" w:hAnsi="Courier New" w:cs="Courier New"/>
+          <w:sz w:val="25"/>
+          <w:sz-cs w:val="25"/>
           <w:i/>
           <w:spacing w:val="0"/>
           <w:color w:val="1A1A1A"/>
@@ -9791,7 +9768,7 @@
           <w:spacing w:val="0"/>
           <w:color w:val="1A1A1A"/>
         </w:rPr>
-        <w:t xml:space="preserve"> p &lt; 0.001, two-sided Fisher exact, α = 0.05. Fisher comparisons reported for the 3B variant against its own zero-shot baseline (0/39); the 1B variant exhibits the same direction of effect under the same conventional thresholds.*</w:t>
+        <w:t xml:space="preserve">` p &lt; 0.001, two-sided Fisher exact, α = 0.05. Fisher comparisons reported for the 3B variant against its own zero-shot baseline (0/39); the 1B variant exhibits the same direction of effect under the same conventional thresholds.*</w:t>
       </w:r>
     </w:p>
     <w:p>
@@ -10131,13 +10108,13 @@
           <w:spacing w:val="0"/>
           <w:color w:val="1A1A1A"/>
         </w:rPr>
-        <w:t xml:space="preserve"> &lt; 0.001 \</w:t>
-      </w:r>
-      <w:r>
-        <w:rPr>
-          <w:rFonts w:ascii="Helvetica" w:hAnsi="Helvetica" w:cs="Helvetica"/>
-          <w:sz w:val="29"/>
-          <w:sz-cs w:val="29"/>
+        <w:t xml:space="preserve"> &lt; 0.001 `</w:t>
+      </w:r>
+      <w:r>
+        <w:rPr>
+          <w:rFonts w:ascii="Courier New" w:hAnsi="Courier New" w:cs="Courier New"/>
+          <w:sz w:val="25"/>
+          <w:sz-cs w:val="25"/>
           <w:i/>
           <w:spacing w:val="0"/>
           <w:color w:val="1A1A1A"/>
@@ -10146,9 +10123,9 @@
       </w:r>
       <w:r>
         <w:rPr>
-          <w:rFonts w:ascii="Helvetica" w:hAnsi="Helvetica" w:cs="Helvetica"/>
-          <w:sz w:val="29"/>
-          <w:sz-cs w:val="29"/>
+          <w:rFonts w:ascii="Courier New" w:hAnsi="Courier New" w:cs="Courier New"/>
+          <w:sz w:val="25"/>
+          <w:sz-cs w:val="25"/>
           <w:spacing w:val="0"/>
           <w:color w:val="1A1A1A"/>
         </w:rPr>
@@ -10159,62 +10136,30 @@
           <w:rFonts w:ascii="Helvetica" w:hAnsi="Helvetica" w:cs="Helvetica"/>
           <w:sz w:val="29"/>
           <w:sz-cs w:val="29"/>
-          <w:i/>
-          <w:spacing w:val="0"/>
-          <w:color w:val="1A1A1A"/>
-        </w:rPr>
-        <w:t xml:space="preserve">. By contrast, the determinism-isolation E1 (0/13 vs. 0/39 baseline) yields </w:t>
-      </w:r>
-      <w:r>
-        <w:rPr>
-          <w:rFonts w:ascii="Helvetica" w:hAnsi="Helvetica" w:cs="Helvetica"/>
-          <w:sz w:val="29"/>
-          <w:sz-cs w:val="29"/>
-          <w:spacing w:val="0"/>
-          <w:color w:val="1A1A1A"/>
-        </w:rPr>
-        <w:t xml:space="preserve">p</w:t>
-      </w:r>
-      <w:r>
-        <w:rPr>
-          <w:rFonts w:ascii="Helvetica" w:hAnsi="Helvetica" w:cs="Helvetica"/>
-          <w:sz w:val="29"/>
-          <w:sz-cs w:val="29"/>
-          <w:i/>
-          <w:spacing w:val="0"/>
-          <w:color w:val="1A1A1A"/>
-        </w:rPr>
-        <w:t xml:space="preserve"> = 1.000 n.s., confirming that the bias is invariant to sampling temperature. The epistemic inference is direct: the Llama 3.2 family models possess the compositional capacity</w:t>
-      </w:r>
-      <w:r>
-        <w:rPr>
-          <w:rFonts w:ascii="Helvetica" w:hAnsi="Helvetica" w:cs="Helvetica"/>
-          <w:sz w:val="29"/>
-          <w:sz-cs w:val="29"/>
-          <w:spacing w:val="0"/>
-          <w:color w:val="1A1A1A"/>
-        </w:rPr>
-        <w:t xml:space="preserve">* to produce </w:t>
-      </w:r>
-      <w:r>
-        <w:rPr>
-          <w:rFonts w:ascii="Courier New" w:hAnsi="Courier New" w:cs="Courier New"/>
-          <w:sz w:val="25"/>
-          <w:sz-cs w:val="25"/>
-          <w:spacing w:val="0"/>
-          <w:color w:val="1A1A1A"/>
-        </w:rPr>
-        <w:t xml:space="preserve">pontos_fortes</w:t>
-      </w:r>
-      <w:r>
-        <w:rPr>
-          <w:rFonts w:ascii="Helvetica" w:hAnsi="Helvetica" w:cs="Helvetica"/>
-          <w:sz w:val="29"/>
-          <w:sz-cs w:val="29"/>
-          <w:spacing w:val="0"/>
-          <w:color w:val="1A1A1A"/>
-        </w:rPr>
-        <w:t xml:space="preserve"> as monolithic string respecting the declared schema; what is compromised is obedience to this specification when provided exclusively in natural language under zero-shot regime, without contextual demonstration. The enumeration attractor is dominant only in the absence of a contrary demonstrative anchor.</w:t>
+          <w:spacing w:val="0"/>
+          <w:color w:val="1A1A1A"/>
+        </w:rPr>
+        <w:t xml:space="preserve">*</w:t>
+      </w:r>
+      <w:r>
+        <w:rPr>
+          <w:rFonts w:ascii="Courier New" w:hAnsi="Courier New" w:cs="Courier New"/>
+          <w:sz w:val="25"/>
+          <w:sz-cs w:val="25"/>
+          <w:spacing w:val="0"/>
+          <w:color w:val="1A1A1A"/>
+        </w:rPr>
+        <w:t xml:space="preserve">. By contrast, the determinism-isolation E1 (0/13 vs. 0/39 baseline) yields *p* = 1.000 n.s., confirming that the bias is invariant to sampling temperature. The epistemic inference is direct: the Llama 3.2 family models **possess the compositional capacity** to produce</w:t>
+      </w:r>
+      <w:r>
+        <w:rPr>
+          <w:rFonts w:ascii="Helvetica" w:hAnsi="Helvetica" w:cs="Helvetica"/>
+          <w:sz w:val="29"/>
+          <w:sz-cs w:val="29"/>
+          <w:spacing w:val="0"/>
+          <w:color w:val="1A1A1A"/>
+        </w:rPr>
+        <w:t xml:space="preserve">pontos_fortes` as monolithic string respecting the declared schema; what is compromised is obedience to this specification when provided exclusively in natural language under zero-shot regime, without contextual demonstration. The enumeration attractor is dominant only in the absence of a contrary demonstrative anchor.</w:t>
       </w:r>
     </w:p>
     <w:p>

</xml_diff>

<commit_message>
README minimalist redesign + remove ORCID/CAPES from presentation surfaces
- Rewrite README (EN+PT) in minimalist academic style (MIT/Stanford convention):
  text-first, no embedded figures, no Mermaid diagrams, no TL;DR tables.
  Compact sections: Overview, Requirements, Installation, Reproduction,
  Structure, Citation, License, Authors.
- Use the full paper title in README (consistency with citation).
- Remove ORCID identifiers from presentation surfaces (README, paper author
  block, interactive HTML report). ORCIDs preserved in CITATION.cff as the
  machine-readable canonical record for databases.
- Remove CAPES scholarship mention (author does not hold the scholarship).

Co-Authored-By: Claude Opus 4.7 (1M context) <noreply@anthropic.com>
</commit_message>
<xml_diff>
--- a/paper/artigo_benchmark_slm.docx
+++ b/paper/artigo_benchmark_slm.docx
@@ -55,27 +55,6 @@
           <w:spacing w:val="0"/>
           <w:color w:val="1A1A1A"/>
         </w:rPr>
-        <w:t xml:space="preserve"> </w:t>
-      </w:r>
-      <w:r>
-        <w:rPr>
-          <w:rFonts w:ascii="Helvetica" w:hAnsi="Helvetica" w:cs="Helvetica"/>
-          <w:sz w:val="29"/>
-          <w:sz-cs w:val="29"/>
-          <w:u w:val="single"/>
-          <w:spacing w:val="0"/>
-          <w:color w:val="092F9D"/>
-        </w:rPr>
-        <w:t xml:space="preserve">ORCID: 0009-0005-3056-5074</w:t>
-      </w:r>
-      <w:r>
-        <w:rPr>
-          <w:rFonts w:ascii="Helvetica" w:hAnsi="Helvetica" w:cs="Helvetica"/>
-          <w:sz w:val="29"/>
-          <w:sz-cs w:val="29"/>
-          <w:spacing w:val="0"/>
-          <w:color w:val="1A1A1A"/>
-        </w:rPr>
         <w:t xml:space="preserve"> Graduate Program in Informatics in Education (PPGIE) Federal University of Rio Grande do Sul (UFRGS) — Porto Alegre, RS, Brazil </w:t>
       </w:r>
       <w:r>
@@ -114,27 +93,6 @@
           <w:color w:val="1A1A1A"/>
         </w:rPr>
         <w:t xml:space="preserve">Marcelo Magalhães Foohs</w:t>
-      </w:r>
-      <w:r>
-        <w:rPr>
-          <w:rFonts w:ascii="Helvetica" w:hAnsi="Helvetica" w:cs="Helvetica"/>
-          <w:sz w:val="29"/>
-          <w:sz-cs w:val="29"/>
-          <w:spacing w:val="0"/>
-          <w:color w:val="1A1A1A"/>
-        </w:rPr>
-        <w:t xml:space="preserve"> </w:t>
-      </w:r>
-      <w:r>
-        <w:rPr>
-          <w:rFonts w:ascii="Helvetica" w:hAnsi="Helvetica" w:cs="Helvetica"/>
-          <w:sz w:val="29"/>
-          <w:sz-cs w:val="29"/>
-          <w:u w:val="single"/>
-          <w:spacing w:val="0"/>
-          <w:color w:val="092F9D"/>
-        </w:rPr>
-        <w:t xml:space="preserve">ORCID: 0000-0002-4735-0732</w:t>
       </w:r>
       <w:r>
         <w:rPr>
@@ -11361,7 +11319,7 @@
           <w:spacing w:val="0"/>
           <w:color w:val="1A1A1A"/>
         </w:rPr>
-        <w:t xml:space="preserve">The authors thank Profa. Dra. Rosa Maria Vicari (PPGIE/UFRGS) for her role as co-advisor in this investigation. The authors also thank the Graduate Program in Informatics in Education (PPGIE) of the Federal University of Rio Grande do Sul (UFRGS) for institutional support, and the Coordination for the Improvement of Higher Education Personnel (CAPES) for the doctoral scholarship funding.</w:t>
+        <w:t xml:space="preserve">The authors thank Profa. Dra. Rosa Maria Vicari (PPGIE/UFRGS) for her role as co-advisor in this investigation, and the Graduate Program in Informatics in Education (PPGIE) of the Federal University of Rio Grande do Sul (UFRGS) for institutional support.</w:t>
       </w:r>
     </w:p>
     <w:p>

</xml_diff>

<commit_message>
Add Zenodo DOI 10.5281/zenodo.20388847 everywhere
- README (EN+PT): DOI badge at the top of the badges row, BibTeX
  entry updated with doi/url/publisher fields, explanatory line
  pointing to the permanent archive
- CITATION.cff: doi, identifiers (with concept DOI description),
  url, repository-code fields added
- Paper: DOI + repository URL printed under the author block on
  the title page; PDF and DOCX regenerated

The DOI 10.5281/zenodo.20388847 is the permanent citable identifier
assigned by Zenodo to the v1.2.0 archive of this benchmark.

Co-Authored-By: Claude Opus 4.7 (1M context) <noreply@anthropic.com>
</commit_message>
<xml_diff>
--- a/paper/artigo_benchmark_slm.docx
+++ b/paper/artigo_benchmark_slm.docx
@@ -113,6 +113,64 @@
           <w:color w:val="1A1A1A"/>
         </w:rPr>
         <w:t xml:space="preserve">mmfoohs@gmail.com</w:t>
+      </w:r>
+      <w:r>
+        <w:rPr>
+          <w:rFonts w:ascii="Helvetica" w:hAnsi="Helvetica" w:cs="Helvetica"/>
+          <w:sz w:val="29"/>
+          <w:sz-cs w:val="29"/>
+          <w:spacing w:val="0"/>
+          <w:color w:val="1A1A1A"/>
+        </w:rPr>
+        <w:t xml:space="preserve"/>
+      </w:r>
+    </w:p>
+    <w:p>
+      <w:pPr>
+        <w:jc w:val="both"/>
+        <w:spacing w:after="175"/>
+      </w:pPr>
+      <w:r>
+        <w:rPr>
+          <w:rFonts w:ascii="Helvetica" w:hAnsi="Helvetica" w:cs="Helvetica"/>
+          <w:sz w:val="29"/>
+          <w:sz-cs w:val="29"/>
+          <w:spacing w:val="0"/>
+          <w:color w:val="1A1A1A"/>
+        </w:rPr>
+        <w:t xml:space="preserve">DOI: </w:t>
+      </w:r>
+      <w:r>
+        <w:rPr>
+          <w:rFonts w:ascii="Helvetica" w:hAnsi="Helvetica" w:cs="Helvetica"/>
+          <w:sz w:val="29"/>
+          <w:sz-cs w:val="29"/>
+          <w:u w:val="single"/>
+          <w:spacing w:val="0"/>
+          <w:color w:val="092F9D"/>
+        </w:rPr>
+        <w:t xml:space="preserve">10.5281/zenodo.20388847</w:t>
+      </w:r>
+      <w:r>
+        <w:rPr>
+          <w:rFonts w:ascii="Helvetica" w:hAnsi="Helvetica" w:cs="Helvetica"/>
+          <w:sz w:val="29"/>
+          <w:sz-cs w:val="29"/>
+          <w:spacing w:val="0"/>
+          <w:color w:val="1A1A1A"/>
+        </w:rPr>
+        <w:t xml:space="preserve"> Code and data: </w:t>
+      </w:r>
+      <w:r>
+        <w:rPr>
+          <w:rFonts w:ascii="Helvetica" w:hAnsi="Helvetica" w:cs="Helvetica"/>
+          <w:sz w:val="29"/>
+          <w:sz-cs w:val="29"/>
+          <w:u w:val="single"/>
+          <w:spacing w:val="0"/>
+          <w:color w:val="092F9D"/>
+        </w:rPr>
+        <w:t xml:space="preserve">github.com/RandMelville/slm-socratic-tutor-ptbr</w:t>
       </w:r>
       <w:r>
         <w:rPr>

</xml_diff>